<commit_message>
2026 학회 발표 2건 추가 (ICoME 2026 패널, iLRN 2026)
Co-Authored-By: Claude Opus 5.5 (1M context) <noreply@anthropic.com>
Claude-Session: https://claude.ai/code/session_01MartpzBbnDQvKJwBepZE6f
</commit_message>
<xml_diff>
--- a/cv/YANG_CV_git.docx
+++ b/cv/YANG_CV_git.docx
@@ -45,7 +45,7 @@
           <w:b/>
           <w:lang w:eastAsia="ko-KR"/>
         </w:rPr>
-        <w:t>LAST UPDATED: 26.04.16.</w:t>
+        <w:t>LAST UPDATED: 26.10.28.</w:t>
       </w:r>
     </w:p>
     <w:p>
@@ -7768,6 +7768,59 @@
           <w:b/>
         </w:rPr>
         <w:t>PRESENTATIONS</w:t>
+      </w:r>
+    </w:p>
+    <w:p>
+      <w:pPr>
+        <w:spacing w:after="80"/>
+        <w:ind w:left="360" w:hanging="360"/>
+      </w:pPr>
+      <w:r>
+        <w:rPr>
+          <w:b/>
+        </w:rPr>
+        <w:t>Yang, E.</w:t>
+      </w:r>
+      <w:r>
+        <w:t xml:space="preserve"> (August 6, 2026). </w:t>
+      </w:r>
+      <w:r>
+        <w:rPr>
+          <w:i/>
+        </w:rPr>
+        <w:t>From spatial interaction data to learning evidence: Trends and gaps in spatial computing research in education</w:t>
+      </w:r>
+      <w:r>
+        <w:t xml:space="preserve"> [Panel session]. The 24th International Conference for Media in Education (ICoME), Honolulu, HI, United States.</w:t>
+      </w:r>
+    </w:p>
+    <w:p>
+      <w:pPr>
+        <w:spacing w:after="80"/>
+        <w:ind w:left="360" w:hanging="360"/>
+      </w:pPr>
+      <w:r>
+        <w:rPr/>
+        <w:t xml:space="preserve">Kim, K., Han, D., </w:t>
+      </w:r>
+      <w:r>
+        <w:rPr>
+          <w:b/>
+        </w:rPr>
+        <w:t>Yang, E.</w:t>
+      </w:r>
+      <w:r>
+        <w:rPr/>
+        <w:t xml:space="preserve">, &amp; Ryu, J. (June 27–30, 2026). </w:t>
+      </w:r>
+      <w:r>
+        <w:rPr>
+          <w:i/>
+        </w:rPr>
+        <w:t>Analysis of attention based on gaze and head movements under task difficulty in an XR diagnostic simulation</w:t>
+      </w:r>
+      <w:r>
+        <w:t xml:space="preserve"> [Paper presentation]. 2026 12th International Conference of the Immersive Learning Research Network (iLRN), Athens, Greece.</w:t>
       </w:r>
     </w:p>
     <w:p>

</xml_diff>